<commit_message>
Deploying to gh-pages from @ eea/CLMS_documents@8a1258924e6e663fae532cfe65d7a23a091adf18 🚀
</commit_message>
<xml_diff>
--- a/develop/products/Urban_Atlas_CLMS_UA2021_LULC_PUM_v1.2.docx
+++ b/develop/products/Urban_Atlas_CLMS_UA2021_LULC_PUM_v1.2.docx
@@ -13820,64 +13820,29 @@
               <w:pStyle w:val="Compact"/>
             </w:pPr>
             <w:r>
-              <w:t xml:space="preserve">1.0</w:t>
-            </w:r>
-          </w:p>
-        </w:tc>
-        <w:tc>
-          <w:tcPr/>
-          <w:p>
-            <w:pPr>
-              <w:pStyle w:val="Compact"/>
-            </w:pPr>
-            <w:r>
-              <w:t xml:space="preserve">22.08.2025</w:t>
-            </w:r>
-          </w:p>
-        </w:tc>
-        <w:tc>
-          <w:tcPr/>
-          <w:p>
-            <w:pPr>
-              <w:pStyle w:val="Compact"/>
-            </w:pPr>
-            <w:r>
-              <w:t xml:space="preserve">Initial final version</w:t>
-            </w:r>
-          </w:p>
-        </w:tc>
-      </w:tr>
-      <w:tr>
-        <w:tc>
-          <w:tcPr/>
-          <w:p>
-            <w:pPr>
-              <w:pStyle w:val="Compact"/>
-            </w:pPr>
-            <w:r>
-              <w:t xml:space="preserve">1.1</w:t>
-            </w:r>
-          </w:p>
-        </w:tc>
-        <w:tc>
-          <w:tcPr/>
-          <w:p>
-            <w:pPr>
-              <w:pStyle w:val="Compact"/>
-            </w:pPr>
-            <w:r>
-              <w:t xml:space="preserve">29.01.2026</w:t>
-            </w:r>
-          </w:p>
-        </w:tc>
-        <w:tc>
-          <w:tcPr/>
-          <w:p>
-            <w:pPr>
-              <w:pStyle w:val="Compact"/>
-            </w:pPr>
-            <w:r>
-              <w:t xml:space="preserve">Minor revisions</w:t>
+              <w:t xml:space="preserve">1.2</w:t>
+            </w:r>
+          </w:p>
+        </w:tc>
+        <w:tc>
+          <w:tcPr/>
+          <w:p>
+            <w:pPr>
+              <w:pStyle w:val="Compact"/>
+            </w:pPr>
+            <w:r>
+              <w:t xml:space="preserve">05.02.2026</w:t>
+            </w:r>
+          </w:p>
+        </w:tc>
+        <w:tc>
+          <w:tcPr/>
+          <w:p>
+            <w:pPr>
+              <w:pStyle w:val="Compact"/>
+            </w:pPr>
+            <w:r>
+              <w:t xml:space="preserve">Initial published issue</w:t>
             </w:r>
           </w:p>
         </w:tc>

</xml_diff>